<commit_message>
Virgo paper added; CV and wordcloud updated
</commit_message>
<xml_diff>
--- a/wordcloud.docx
+++ b/wordcloud.docx
@@ -2614,7 +2614,11 @@
     <w:p>
       <w:pPr>
         <w:rPr>
-          <w:rFonts w:ascii="Times New Roman" w:eastAsia="Times New Roman" w:hAnsi="Times New Roman" w:cs="Times New Roman"/>
+          <w:rFonts w:ascii="Lucida Grande" w:eastAsia="Times New Roman" w:hAnsi="Lucida Grande" w:cs="Lucida Grande"/>
+          <w:color w:val="000000"/>
+          <w:sz w:val="22"/>
+          <w:szCs w:val="22"/>
+          <w:shd w:val="clear" w:color="auto" w:fill="FFFFFF"/>
         </w:rPr>
       </w:pPr>
       <w:r>
@@ -3107,6 +3111,837 @@
         </w:rPr>
         <w:t>6</w:t>
       </w:r>
+      <w:r>
+        <w:rPr>
+          <w:rFonts w:ascii="Lucida Grande" w:eastAsia="Times New Roman" w:hAnsi="Lucida Grande" w:cs="Lucida Grande"/>
+          <w:color w:val="000000"/>
+          <w:sz w:val="22"/>
+          <w:szCs w:val="22"/>
+          <w:shd w:val="clear" w:color="auto" w:fill="FFFFFF"/>
+        </w:rPr>
+        <w:t> </w:t>
+      </w:r>
+      <w:proofErr w:type="spellStart"/>
+      <w:r>
+        <w:rPr>
+          <w:rFonts w:ascii="Lucida Grande" w:eastAsia="Times New Roman" w:hAnsi="Lucida Grande" w:cs="Lucida Grande"/>
+          <w:color w:val="000000"/>
+          <w:sz w:val="22"/>
+          <w:szCs w:val="22"/>
+          <w:shd w:val="clear" w:color="auto" w:fill="FFFFFF"/>
+        </w:rPr>
+        <w:t>dex</w:t>
+      </w:r>
+      <w:proofErr w:type="spellEnd"/>
+      <w:r>
+        <w:rPr>
+          <w:rFonts w:ascii="Lucida Grande" w:eastAsia="Times New Roman" w:hAnsi="Lucida Grande" w:cs="Lucida Grande"/>
+          <w:color w:val="000000"/>
+          <w:sz w:val="22"/>
+          <w:szCs w:val="22"/>
+          <w:shd w:val="clear" w:color="auto" w:fill="FFFFFF"/>
+        </w:rPr>
+        <w:t xml:space="preserve"> for </w:t>
+      </w:r>
+      <w:r>
+        <w:rPr>
+          <w:rFonts w:ascii="STIXGeneral-Italic" w:eastAsia="Times New Roman" w:hAnsi="STIXGeneral-Italic" w:cs="Lucida Grande"/>
+          <w:color w:val="000000"/>
+          <w:sz w:val="26"/>
+          <w:szCs w:val="26"/>
+          <w:bdr w:val="none" w:sz="0" w:space="0" w:color="auto" w:frame="1"/>
+        </w:rPr>
+        <w:t>M</w:t>
+      </w:r>
+      <w:r>
+        <w:rPr>
+          <w:rFonts w:ascii="STIXGeneral-Regular" w:eastAsia="Times New Roman" w:hAnsi="STIXGeneral-Regular" w:cs="Lucida Grande"/>
+          <w:color w:val="000000"/>
+          <w:sz w:val="18"/>
+          <w:szCs w:val="18"/>
+          <w:bdr w:val="none" w:sz="0" w:space="0" w:color="auto" w:frame="1"/>
+        </w:rPr>
+        <w:t>BH</w:t>
+      </w:r>
+      <w:r>
+        <w:rPr>
+          <w:rFonts w:ascii="Lucida Grande" w:eastAsia="Times New Roman" w:hAnsi="Lucida Grande" w:cs="Lucida Grande"/>
+          <w:color w:val="000000"/>
+          <w:sz w:val="22"/>
+          <w:szCs w:val="22"/>
+          <w:shd w:val="clear" w:color="auto" w:fill="FFFFFF"/>
+        </w:rPr>
+        <w:t> on </w:t>
+      </w:r>
+      <w:r>
+        <w:rPr>
+          <w:rFonts w:ascii="STIXGeneral-Italic" w:eastAsia="Times New Roman" w:hAnsi="STIXGeneral-Italic" w:cs="Lucida Grande"/>
+          <w:color w:val="000000"/>
+          <w:sz w:val="26"/>
+          <w:szCs w:val="26"/>
+          <w:bdr w:val="none" w:sz="0" w:space="0" w:color="auto" w:frame="1"/>
+        </w:rPr>
+        <w:t>M</w:t>
+      </w:r>
+      <w:r>
+        <w:rPr>
+          <w:rFonts w:ascii="STIXGeneral-Regular" w:eastAsia="Times New Roman" w:hAnsi="STIXGeneral-Regular" w:cs="Lucida Grande"/>
+          <w:color w:val="000000"/>
+          <w:sz w:val="18"/>
+          <w:szCs w:val="18"/>
+          <w:bdr w:val="none" w:sz="0" w:space="0" w:color="auto" w:frame="1"/>
+        </w:rPr>
+        <w:t>∗,</w:t>
+      </w:r>
+      <w:proofErr w:type="spellStart"/>
+      <w:r>
+        <w:rPr>
+          <w:rFonts w:ascii="STIXGeneral-Regular" w:eastAsia="Times New Roman" w:hAnsi="STIXGeneral-Regular" w:cs="Lucida Grande"/>
+          <w:color w:val="000000"/>
+          <w:sz w:val="18"/>
+          <w:szCs w:val="18"/>
+          <w:bdr w:val="none" w:sz="0" w:space="0" w:color="auto" w:frame="1"/>
+        </w:rPr>
+        <w:t>sph</w:t>
+      </w:r>
+      <w:proofErr w:type="spellEnd"/>
+      <w:r>
+        <w:rPr>
+          <w:rFonts w:ascii="Lucida Grande" w:eastAsia="Times New Roman" w:hAnsi="Lucida Grande" w:cs="Lucida Grande"/>
+          <w:color w:val="000000"/>
+          <w:sz w:val="22"/>
+          <w:szCs w:val="22"/>
+          <w:shd w:val="clear" w:color="auto" w:fill="FFFFFF"/>
+        </w:rPr>
+        <w:t> and </w:t>
+      </w:r>
+      <w:r>
+        <w:rPr>
+          <w:rFonts w:ascii="STIXGeneral-Regular" w:eastAsia="Times New Roman" w:hAnsi="STIXGeneral-Regular" w:cs="Lucida Grande"/>
+          <w:color w:val="000000"/>
+          <w:sz w:val="26"/>
+          <w:szCs w:val="26"/>
+          <w:bdr w:val="none" w:sz="0" w:space="0" w:color="auto" w:frame="1"/>
+        </w:rPr>
+        <w:t>0.57</w:t>
+      </w:r>
+      <w:r>
+        <w:rPr>
+          <w:rFonts w:ascii="Lucida Grande" w:eastAsia="Times New Roman" w:hAnsi="Lucida Grande" w:cs="Lucida Grande"/>
+          <w:color w:val="000000"/>
+          <w:sz w:val="22"/>
+          <w:szCs w:val="22"/>
+          <w:shd w:val="clear" w:color="auto" w:fill="FFFFFF"/>
+        </w:rPr>
+        <w:t> </w:t>
+      </w:r>
+      <w:proofErr w:type="spellStart"/>
+      <w:r>
+        <w:rPr>
+          <w:rFonts w:ascii="Lucida Grande" w:eastAsia="Times New Roman" w:hAnsi="Lucida Grande" w:cs="Lucida Grande"/>
+          <w:color w:val="000000"/>
+          <w:sz w:val="22"/>
+          <w:szCs w:val="22"/>
+          <w:shd w:val="clear" w:color="auto" w:fill="FFFFFF"/>
+        </w:rPr>
+        <w:t>dex</w:t>
+      </w:r>
+      <w:proofErr w:type="spellEnd"/>
+      <w:r>
+        <w:rPr>
+          <w:rFonts w:ascii="Lucida Grande" w:eastAsia="Times New Roman" w:hAnsi="Lucida Grande" w:cs="Lucida Grande"/>
+          <w:color w:val="000000"/>
+          <w:sz w:val="22"/>
+          <w:szCs w:val="22"/>
+          <w:shd w:val="clear" w:color="auto" w:fill="FFFFFF"/>
+        </w:rPr>
+        <w:t xml:space="preserve"> for </w:t>
+      </w:r>
+      <w:r>
+        <w:rPr>
+          <w:rFonts w:ascii="STIXGeneral-Italic" w:eastAsia="Times New Roman" w:hAnsi="STIXGeneral-Italic" w:cs="Lucida Grande"/>
+          <w:color w:val="000000"/>
+          <w:sz w:val="26"/>
+          <w:szCs w:val="26"/>
+          <w:bdr w:val="none" w:sz="0" w:space="0" w:color="auto" w:frame="1"/>
+        </w:rPr>
+        <w:t>M</w:t>
+      </w:r>
+      <w:r>
+        <w:rPr>
+          <w:rFonts w:ascii="STIXGeneral-Regular" w:eastAsia="Times New Roman" w:hAnsi="STIXGeneral-Regular" w:cs="Lucida Grande"/>
+          <w:color w:val="000000"/>
+          <w:sz w:val="18"/>
+          <w:szCs w:val="18"/>
+          <w:bdr w:val="none" w:sz="0" w:space="0" w:color="auto" w:frame="1"/>
+        </w:rPr>
+        <w:t>BH</w:t>
+      </w:r>
+      <w:r>
+        <w:rPr>
+          <w:rFonts w:ascii="Lucida Grande" w:eastAsia="Times New Roman" w:hAnsi="Lucida Grande" w:cs="Lucida Grande"/>
+          <w:color w:val="000000"/>
+          <w:sz w:val="22"/>
+          <w:szCs w:val="22"/>
+          <w:shd w:val="clear" w:color="auto" w:fill="FFFFFF"/>
+        </w:rPr>
+        <w:t> on </w:t>
+      </w:r>
+      <w:r>
+        <w:rPr>
+          <w:rFonts w:ascii="STIXGeneral-Italic" w:eastAsia="Times New Roman" w:hAnsi="STIXGeneral-Italic" w:cs="Lucida Grande"/>
+          <w:color w:val="000000"/>
+          <w:sz w:val="26"/>
+          <w:szCs w:val="26"/>
+          <w:bdr w:val="none" w:sz="0" w:space="0" w:color="auto" w:frame="1"/>
+        </w:rPr>
+        <w:t>σ</w:t>
+      </w:r>
+      <w:r>
+        <w:rPr>
+          <w:rFonts w:ascii="STIXGeneral-Regular" w:eastAsia="Times New Roman" w:hAnsi="STIXGeneral-Regular" w:cs="Lucida Grande"/>
+          <w:color w:val="000000"/>
+          <w:sz w:val="18"/>
+          <w:szCs w:val="18"/>
+          <w:bdr w:val="none" w:sz="0" w:space="0" w:color="auto" w:frame="1"/>
+        </w:rPr>
+        <w:t>∗</w:t>
+      </w:r>
+      <w:r>
+        <w:rPr>
+          <w:rFonts w:ascii="Lucida Grande" w:eastAsia="Times New Roman" w:hAnsi="Lucida Grande" w:cs="Lucida Grande"/>
+          <w:color w:val="000000"/>
+          <w:sz w:val="22"/>
+          <w:szCs w:val="22"/>
+          <w:shd w:val="clear" w:color="auto" w:fill="FFFFFF"/>
+        </w:rPr>
+        <w:t>. The slope is </w:t>
+      </w:r>
+      <w:r>
+        <w:rPr>
+          <w:rFonts w:ascii="STIXGeneral-Regular" w:eastAsia="Times New Roman" w:hAnsi="STIXGeneral-Regular" w:cs="Lucida Grande"/>
+          <w:color w:val="000000"/>
+          <w:sz w:val="26"/>
+          <w:szCs w:val="26"/>
+          <w:bdr w:val="none" w:sz="0" w:space="0" w:color="auto" w:frame="1"/>
+        </w:rPr>
+        <w:t>&gt;2</w:t>
+      </w:r>
+      <w:r>
+        <w:rPr>
+          <w:rFonts w:ascii="Lucida Grande" w:eastAsia="Times New Roman" w:hAnsi="Lucida Grande" w:cs="Lucida Grande"/>
+          <w:color w:val="000000"/>
+          <w:sz w:val="22"/>
+          <w:szCs w:val="22"/>
+          <w:shd w:val="clear" w:color="auto" w:fill="FFFFFF"/>
+        </w:rPr>
+        <w:t> times that obtained using core-</w:t>
+      </w:r>
+      <w:r>
+        <w:rPr>
+          <w:rFonts w:ascii="-webkit-standard" w:eastAsia="Times New Roman" w:hAnsi="-webkit-standard" w:cs="Times New Roman"/>
+          <w:color w:val="000000"/>
+          <w:sz w:val="27"/>
+          <w:szCs w:val="27"/>
+          <w:shd w:val="clear" w:color="auto" w:fill="FFFFFF"/>
+        </w:rPr>
+        <w:t>Sérsic</w:t>
+      </w:r>
+      <w:r>
+        <w:rPr>
+          <w:rFonts w:ascii="Lucida Grande" w:eastAsia="Times New Roman" w:hAnsi="Lucida Grande" w:cs="Lucida Grande"/>
+          <w:color w:val="000000"/>
+          <w:sz w:val="22"/>
+          <w:szCs w:val="22"/>
+          <w:shd w:val="clear" w:color="auto" w:fill="FFFFFF"/>
+        </w:rPr>
+        <w:t xml:space="preserve"> </w:t>
+      </w:r>
+      <w:r>
+        <w:rPr>
+          <w:rFonts w:ascii="Lucida Grande" w:eastAsia="Times New Roman" w:hAnsi="Lucida Grande" w:cs="Lucida Grande"/>
+          <w:color w:val="000000"/>
+          <w:sz w:val="22"/>
+          <w:szCs w:val="22"/>
+          <w:shd w:val="clear" w:color="auto" w:fill="FFFFFF"/>
+        </w:rPr>
+        <w:t>early-type galaxies, echoing a similar result involving </w:t>
+      </w:r>
+      <w:r>
+        <w:rPr>
+          <w:rFonts w:ascii="STIXGeneral-Italic" w:eastAsia="Times New Roman" w:hAnsi="STIXGeneral-Italic" w:cs="Lucida Grande"/>
+          <w:color w:val="000000"/>
+          <w:sz w:val="26"/>
+          <w:szCs w:val="26"/>
+          <w:bdr w:val="none" w:sz="0" w:space="0" w:color="auto" w:frame="1"/>
+        </w:rPr>
+        <w:t>M</w:t>
+      </w:r>
+      <w:r>
+        <w:rPr>
+          <w:rFonts w:ascii="STIXGeneral-Regular" w:eastAsia="Times New Roman" w:hAnsi="STIXGeneral-Regular" w:cs="Lucida Grande"/>
+          <w:color w:val="000000"/>
+          <w:sz w:val="18"/>
+          <w:szCs w:val="18"/>
+          <w:bdr w:val="none" w:sz="0" w:space="0" w:color="auto" w:frame="1"/>
+        </w:rPr>
+        <w:t>∗,</w:t>
+      </w:r>
+      <w:proofErr w:type="spellStart"/>
+      <w:r>
+        <w:rPr>
+          <w:rFonts w:ascii="STIXGeneral-Regular" w:eastAsia="Times New Roman" w:hAnsi="STIXGeneral-Regular" w:cs="Lucida Grande"/>
+          <w:color w:val="000000"/>
+          <w:sz w:val="18"/>
+          <w:szCs w:val="18"/>
+          <w:bdr w:val="none" w:sz="0" w:space="0" w:color="auto" w:frame="1"/>
+        </w:rPr>
+        <w:t>sph</w:t>
+      </w:r>
+      <w:proofErr w:type="spellEnd"/>
+      <w:r>
+        <w:rPr>
+          <w:rFonts w:ascii="Lucida Grande" w:eastAsia="Times New Roman" w:hAnsi="Lucida Grande" w:cs="Lucida Grande"/>
+          <w:color w:val="000000"/>
+          <w:sz w:val="22"/>
+          <w:szCs w:val="22"/>
+          <w:shd w:val="clear" w:color="auto" w:fill="FFFFFF"/>
+        </w:rPr>
+        <w:t>, and supporting a varied growth mechanism among different morphological types. This steeper relation has consequences for galaxy/black hole formation theories, simulations, and predicting black hole masses. We caution that (</w:t>
+      </w:r>
+      <w:proofErr w:type="spellStart"/>
+      <w:r>
+        <w:rPr>
+          <w:rFonts w:ascii="Lucida Grande" w:eastAsia="Times New Roman" w:hAnsi="Lucida Grande" w:cs="Lucida Grande"/>
+          <w:color w:val="000000"/>
+          <w:sz w:val="22"/>
+          <w:szCs w:val="22"/>
+          <w:shd w:val="clear" w:color="auto" w:fill="FFFFFF"/>
+        </w:rPr>
+        <w:t>i</w:t>
+      </w:r>
+      <w:proofErr w:type="spellEnd"/>
+      <w:r>
+        <w:rPr>
+          <w:rFonts w:ascii="Lucida Grande" w:eastAsia="Times New Roman" w:hAnsi="Lucida Grande" w:cs="Lucida Grande"/>
+          <w:color w:val="000000"/>
+          <w:sz w:val="22"/>
+          <w:szCs w:val="22"/>
+          <w:shd w:val="clear" w:color="auto" w:fill="FFFFFF"/>
+        </w:rPr>
+        <w:t>) a </w:t>
+      </w:r>
+      <w:proofErr w:type="spellStart"/>
+      <w:r>
+        <w:rPr>
+          <w:rFonts w:ascii="STIXGeneral-Italic" w:eastAsia="Times New Roman" w:hAnsi="STIXGeneral-Italic" w:cs="Lucida Grande"/>
+          <w:color w:val="000000"/>
+          <w:sz w:val="26"/>
+          <w:szCs w:val="26"/>
+          <w:bdr w:val="none" w:sz="0" w:space="0" w:color="auto" w:frame="1"/>
+        </w:rPr>
+        <w:t>M</w:t>
+      </w:r>
+      <w:r>
+        <w:rPr>
+          <w:rFonts w:ascii="STIXGeneral-Regular" w:eastAsia="Times New Roman" w:hAnsi="STIXGeneral-Regular" w:cs="Lucida Grande"/>
+          <w:color w:val="000000"/>
+          <w:sz w:val="18"/>
+          <w:szCs w:val="18"/>
+          <w:bdr w:val="none" w:sz="0" w:space="0" w:color="auto" w:frame="1"/>
+        </w:rPr>
+        <w:t>BH</w:t>
+      </w:r>
+      <w:r>
+        <w:rPr>
+          <w:rFonts w:ascii="Lucida Grande" w:eastAsia="Times New Roman" w:hAnsi="Lucida Grande" w:cs="Lucida Grande"/>
+          <w:color w:val="000000"/>
+          <w:sz w:val="22"/>
+          <w:szCs w:val="22"/>
+          <w:shd w:val="clear" w:color="auto" w:fill="FFFFFF"/>
+        </w:rPr>
+        <w:t>-</w:t>
+      </w:r>
+      <w:r>
+        <w:rPr>
+          <w:rFonts w:ascii="STIXGeneral-Italic" w:eastAsia="Times New Roman" w:hAnsi="STIXGeneral-Italic" w:cs="Lucida Grande"/>
+          <w:color w:val="000000"/>
+          <w:sz w:val="26"/>
+          <w:szCs w:val="26"/>
+          <w:bdr w:val="none" w:sz="0" w:space="0" w:color="auto" w:frame="1"/>
+        </w:rPr>
+        <w:t>M</w:t>
+      </w:r>
+      <w:proofErr w:type="gramStart"/>
+      <w:r>
+        <w:rPr>
+          <w:rFonts w:ascii="STIXGeneral-Regular" w:eastAsia="Times New Roman" w:hAnsi="STIXGeneral-Regular" w:cs="Lucida Grande"/>
+          <w:color w:val="000000"/>
+          <w:sz w:val="18"/>
+          <w:szCs w:val="18"/>
+          <w:bdr w:val="none" w:sz="0" w:space="0" w:color="auto" w:frame="1"/>
+        </w:rPr>
+        <w:t>∗,tot</w:t>
+      </w:r>
+      <w:proofErr w:type="spellEnd"/>
+      <w:proofErr w:type="gramEnd"/>
+      <w:r>
+        <w:rPr>
+          <w:rFonts w:ascii="Lucida Grande" w:eastAsia="Times New Roman" w:hAnsi="Lucida Grande" w:cs="Lucida Grande"/>
+          <w:color w:val="000000"/>
+          <w:sz w:val="22"/>
+          <w:szCs w:val="22"/>
+          <w:shd w:val="clear" w:color="auto" w:fill="FFFFFF"/>
+        </w:rPr>
+        <w:t> relation built from a mixture of early- and late-type galaxies will find an arbitrary slope of approximately 1 to 3, with no physical meaning beyond one's sample selection; and (ii) evolutionary studies of the </w:t>
+      </w:r>
+      <w:proofErr w:type="spellStart"/>
+      <w:r>
+        <w:rPr>
+          <w:rFonts w:ascii="STIXGeneral-Italic" w:eastAsia="Times New Roman" w:hAnsi="STIXGeneral-Italic" w:cs="Lucida Grande"/>
+          <w:color w:val="000000"/>
+          <w:sz w:val="26"/>
+          <w:szCs w:val="26"/>
+          <w:bdr w:val="none" w:sz="0" w:space="0" w:color="auto" w:frame="1"/>
+        </w:rPr>
+        <w:t>M</w:t>
+      </w:r>
+      <w:r>
+        <w:rPr>
+          <w:rFonts w:ascii="STIXGeneral-Regular" w:eastAsia="Times New Roman" w:hAnsi="STIXGeneral-Regular" w:cs="Lucida Grande"/>
+          <w:color w:val="000000"/>
+          <w:sz w:val="18"/>
+          <w:szCs w:val="18"/>
+          <w:bdr w:val="none" w:sz="0" w:space="0" w:color="auto" w:frame="1"/>
+        </w:rPr>
+        <w:t>BH</w:t>
+      </w:r>
+      <w:r>
+        <w:rPr>
+          <w:rFonts w:ascii="Lucida Grande" w:eastAsia="Times New Roman" w:hAnsi="Lucida Grande" w:cs="Lucida Grande"/>
+          <w:color w:val="000000"/>
+          <w:sz w:val="22"/>
+          <w:szCs w:val="22"/>
+          <w:shd w:val="clear" w:color="auto" w:fill="FFFFFF"/>
+        </w:rPr>
+        <w:t>-</w:t>
+      </w:r>
+      <w:r>
+        <w:rPr>
+          <w:rFonts w:ascii="STIXGeneral-Italic" w:eastAsia="Times New Roman" w:hAnsi="STIXGeneral-Italic" w:cs="Lucida Grande"/>
+          <w:color w:val="000000"/>
+          <w:sz w:val="26"/>
+          <w:szCs w:val="26"/>
+          <w:bdr w:val="none" w:sz="0" w:space="0" w:color="auto" w:frame="1"/>
+        </w:rPr>
+        <w:t>M</w:t>
+      </w:r>
+      <w:r>
+        <w:rPr>
+          <w:rFonts w:ascii="STIXGeneral-Regular" w:eastAsia="Times New Roman" w:hAnsi="STIXGeneral-Regular" w:cs="Lucida Grande"/>
+          <w:color w:val="000000"/>
+          <w:sz w:val="18"/>
+          <w:szCs w:val="18"/>
+          <w:bdr w:val="none" w:sz="0" w:space="0" w:color="auto" w:frame="1"/>
+        </w:rPr>
+        <w:t>∗,tot</w:t>
+      </w:r>
+      <w:proofErr w:type="spellEnd"/>
+      <w:r>
+        <w:rPr>
+          <w:rFonts w:ascii="Lucida Grande" w:eastAsia="Times New Roman" w:hAnsi="Lucida Grande" w:cs="Lucida Grande"/>
+          <w:color w:val="000000"/>
+          <w:sz w:val="22"/>
+          <w:szCs w:val="22"/>
+          <w:shd w:val="clear" w:color="auto" w:fill="FFFFFF"/>
+        </w:rPr>
+        <w:t> relation need to be mindful of the galaxy types included at each epoch. We additionally update the </w:t>
+      </w:r>
+      <w:proofErr w:type="spellStart"/>
+      <w:r>
+        <w:rPr>
+          <w:rFonts w:ascii="STIXGeneral-Italic" w:eastAsia="Times New Roman" w:hAnsi="STIXGeneral-Italic" w:cs="Lucida Grande"/>
+          <w:color w:val="000000"/>
+          <w:sz w:val="26"/>
+          <w:szCs w:val="26"/>
+          <w:bdr w:val="none" w:sz="0" w:space="0" w:color="auto" w:frame="1"/>
+        </w:rPr>
+        <w:t>M</w:t>
+      </w:r>
+      <w:proofErr w:type="gramStart"/>
+      <w:r>
+        <w:rPr>
+          <w:rFonts w:ascii="STIXGeneral-Regular" w:eastAsia="Times New Roman" w:hAnsi="STIXGeneral-Regular" w:cs="Lucida Grande"/>
+          <w:color w:val="000000"/>
+          <w:sz w:val="18"/>
+          <w:szCs w:val="18"/>
+          <w:bdr w:val="none" w:sz="0" w:space="0" w:color="auto" w:frame="1"/>
+        </w:rPr>
+        <w:t>∗,tot</w:t>
+      </w:r>
+      <w:proofErr w:type="spellEnd"/>
+      <w:proofErr w:type="gramEnd"/>
+      <w:r>
+        <w:rPr>
+          <w:rFonts w:ascii="Lucida Grande" w:eastAsia="Times New Roman" w:hAnsi="Lucida Grande" w:cs="Lucida Grande"/>
+          <w:color w:val="000000"/>
+          <w:sz w:val="22"/>
+          <w:szCs w:val="22"/>
+          <w:shd w:val="clear" w:color="auto" w:fill="FFFFFF"/>
+        </w:rPr>
+        <w:t>-(face-on spiral arm pitch angle) relation.</w:t>
+      </w:r>
+    </w:p>
+    <w:p>
+      <w:pPr>
+        <w:rPr>
+          <w:rFonts w:ascii="Times New Roman" w:eastAsia="Times New Roman" w:hAnsi="Times New Roman" w:cs="Times New Roman"/>
+        </w:rPr>
+      </w:pPr>
+    </w:p>
+    <w:p>
+      <w:pPr>
+        <w:rPr>
+          <w:rFonts w:ascii="Times New Roman" w:eastAsia="Times New Roman" w:hAnsi="Times New Roman" w:cs="Times New Roman"/>
+        </w:rPr>
+      </w:pPr>
+      <w:r>
+        <w:rPr>
+          <w:rFonts w:ascii="Lucida Grande" w:eastAsia="Times New Roman" w:hAnsi="Lucida Grande" w:cs="Lucida Grande"/>
+          <w:color w:val="000000"/>
+          <w:sz w:val="22"/>
+          <w:szCs w:val="22"/>
+          <w:shd w:val="clear" w:color="auto" w:fill="FFFFFF"/>
+        </w:rPr>
+        <w:t>The Chandra X-ray Observatory's Cycle 18 Large Program titled "Spiral galaxies of the Virgo Cluster" will image 52 galaxies with the ACIS-S detector. Combined with archival data for an additional 22 galaxies, this will represent the complete sample of 74 spiral galaxies in the Virgo cluster with star-formation rates </w:t>
+      </w:r>
+      <w:r>
+        <w:rPr>
+          <w:rFonts w:ascii="STIXGeneral-Regular" w:eastAsia="Times New Roman" w:hAnsi="STIXGeneral-Regular" w:cs="Lucida Grande"/>
+          <w:color w:val="000000"/>
+          <w:sz w:val="27"/>
+          <w:szCs w:val="27"/>
+          <w:bdr w:val="none" w:sz="0" w:space="0" w:color="auto" w:frame="1"/>
+        </w:rPr>
+        <w:t>≳</w:t>
+      </w:r>
+      <w:r>
+        <w:rPr>
+          <w:rFonts w:ascii="Lucida Grande" w:eastAsia="Times New Roman" w:hAnsi="Lucida Grande" w:cs="Lucida Grande"/>
+          <w:color w:val="000000"/>
+          <w:sz w:val="22"/>
+          <w:szCs w:val="22"/>
+          <w:shd w:val="clear" w:color="auto" w:fill="FFFFFF"/>
+        </w:rPr>
+        <w:t> 0.3 </w:t>
+      </w:r>
+      <w:r>
+        <w:rPr>
+          <w:rFonts w:ascii="STIXGeneral-Italic" w:eastAsia="Times New Roman" w:hAnsi="STIXGeneral-Italic" w:cs="Lucida Grande"/>
+          <w:color w:val="000000"/>
+          <w:sz w:val="27"/>
+          <w:szCs w:val="27"/>
+          <w:bdr w:val="none" w:sz="0" w:space="0" w:color="auto" w:frame="1"/>
+        </w:rPr>
+        <w:t>M</w:t>
+      </w:r>
+      <w:r>
+        <w:rPr>
+          <w:rFonts w:ascii="STIXGeneral-Regular" w:eastAsia="Times New Roman" w:hAnsi="STIXGeneral-Regular" w:cs="Lucida Grande"/>
+          <w:color w:val="000000"/>
+          <w:sz w:val="19"/>
+          <w:szCs w:val="19"/>
+          <w:bdr w:val="none" w:sz="0" w:space="0" w:color="auto" w:frame="1"/>
+        </w:rPr>
+        <w:t>⊙</w:t>
+      </w:r>
+      <w:r>
+        <w:rPr>
+          <w:rFonts w:ascii="Lucida Grande" w:eastAsia="Times New Roman" w:hAnsi="Lucida Grande" w:cs="Lucida Grande"/>
+          <w:color w:val="000000"/>
+          <w:sz w:val="22"/>
+          <w:szCs w:val="22"/>
+          <w:shd w:val="clear" w:color="auto" w:fill="FFFFFF"/>
+        </w:rPr>
+        <w:t>/yr. Many of these galaxies are expected to have an active nucleus, signalling the presence of a central black hole. In preparation for this survey, we predict the central black hole masses using the latest black hole scaling relations based on spiral arm pitch angle </w:t>
+      </w:r>
+      <w:r>
+        <w:rPr>
+          <w:rFonts w:ascii="STIXGeneral-Regular" w:eastAsia="Times New Roman" w:hAnsi="STIXGeneral-Regular" w:cs="Lucida Grande"/>
+          <w:color w:val="000000"/>
+          <w:sz w:val="27"/>
+          <w:szCs w:val="27"/>
+          <w:bdr w:val="none" w:sz="0" w:space="0" w:color="auto" w:frame="1"/>
+        </w:rPr>
+        <w:t>φ</w:t>
+      </w:r>
+      <w:r>
+        <w:rPr>
+          <w:rFonts w:ascii="Lucida Grande" w:eastAsia="Times New Roman" w:hAnsi="Lucida Grande" w:cs="Lucida Grande"/>
+          <w:color w:val="000000"/>
+          <w:sz w:val="22"/>
+          <w:szCs w:val="22"/>
+          <w:shd w:val="clear" w:color="auto" w:fill="FFFFFF"/>
+        </w:rPr>
+        <w:t>, velocity dispersion </w:t>
+      </w:r>
+      <w:r>
+        <w:rPr>
+          <w:rFonts w:ascii="STIXGeneral-Regular" w:eastAsia="Times New Roman" w:hAnsi="STIXGeneral-Regular" w:cs="Lucida Grande"/>
+          <w:color w:val="000000"/>
+          <w:sz w:val="27"/>
+          <w:szCs w:val="27"/>
+          <w:bdr w:val="none" w:sz="0" w:space="0" w:color="auto" w:frame="1"/>
+        </w:rPr>
+        <w:t>σ</w:t>
+      </w:r>
+      <w:r>
+        <w:rPr>
+          <w:rFonts w:ascii="Lucida Grande" w:eastAsia="Times New Roman" w:hAnsi="Lucida Grande" w:cs="Lucida Grande"/>
+          <w:color w:val="000000"/>
+          <w:sz w:val="22"/>
+          <w:szCs w:val="22"/>
+          <w:shd w:val="clear" w:color="auto" w:fill="FFFFFF"/>
+        </w:rPr>
+        <w:t>, and total stellar mass </w:t>
+      </w:r>
+      <w:proofErr w:type="spellStart"/>
+      <w:r>
+        <w:rPr>
+          <w:rFonts w:ascii="STIXGeneral-Italic" w:eastAsia="Times New Roman" w:hAnsi="STIXGeneral-Italic" w:cs="Lucida Grande"/>
+          <w:color w:val="000000"/>
+          <w:sz w:val="27"/>
+          <w:szCs w:val="27"/>
+          <w:bdr w:val="none" w:sz="0" w:space="0" w:color="auto" w:frame="1"/>
+        </w:rPr>
+        <w:t>M</w:t>
+      </w:r>
+      <w:proofErr w:type="gramStart"/>
+      <w:r>
+        <w:rPr>
+          <w:rFonts w:ascii="STIXGeneral-Regular" w:eastAsia="Times New Roman" w:hAnsi="STIXGeneral-Regular" w:cs="Lucida Grande"/>
+          <w:color w:val="000000"/>
+          <w:sz w:val="19"/>
+          <w:szCs w:val="19"/>
+          <w:bdr w:val="none" w:sz="0" w:space="0" w:color="auto" w:frame="1"/>
+        </w:rPr>
+        <w:t>∗,galaxy</w:t>
+      </w:r>
+      <w:proofErr w:type="spellEnd"/>
+      <w:proofErr w:type="gramEnd"/>
+      <w:r>
+        <w:rPr>
+          <w:rFonts w:ascii="Lucida Grande" w:eastAsia="Times New Roman" w:hAnsi="Lucida Grande" w:cs="Lucida Grande"/>
+          <w:color w:val="000000"/>
+          <w:sz w:val="22"/>
+          <w:szCs w:val="22"/>
+          <w:shd w:val="clear" w:color="auto" w:fill="FFFFFF"/>
+        </w:rPr>
+        <w:t>. With a focus on intermediate mass black holes (</w:t>
+      </w:r>
+      <w:r>
+        <w:rPr>
+          <w:rFonts w:ascii="STIXGeneral-Regular" w:eastAsia="Times New Roman" w:hAnsi="STIXGeneral-Regular" w:cs="Lucida Grande"/>
+          <w:color w:val="000000"/>
+          <w:sz w:val="27"/>
+          <w:szCs w:val="27"/>
+          <w:bdr w:val="none" w:sz="0" w:space="0" w:color="auto" w:frame="1"/>
+        </w:rPr>
+        <w:t>10</w:t>
+      </w:r>
+      <w:r>
+        <w:rPr>
+          <w:rFonts w:ascii="STIXGeneral-Regular" w:eastAsia="Times New Roman" w:hAnsi="STIXGeneral-Regular" w:cs="Lucida Grande"/>
+          <w:color w:val="000000"/>
+          <w:sz w:val="19"/>
+          <w:szCs w:val="19"/>
+          <w:bdr w:val="none" w:sz="0" w:space="0" w:color="auto" w:frame="1"/>
+        </w:rPr>
+        <w:t>2</w:t>
+      </w:r>
+      <w:r>
+        <w:rPr>
+          <w:rFonts w:ascii="STIXGeneral-Regular" w:eastAsia="Times New Roman" w:hAnsi="STIXGeneral-Regular" w:cs="Lucida Grande"/>
+          <w:color w:val="000000"/>
+          <w:sz w:val="27"/>
+          <w:szCs w:val="27"/>
+          <w:bdr w:val="none" w:sz="0" w:space="0" w:color="auto" w:frame="1"/>
+        </w:rPr>
+        <w:t>&lt;</w:t>
+      </w:r>
+      <w:proofErr w:type="spellStart"/>
+      <w:r>
+        <w:rPr>
+          <w:rFonts w:ascii="STIXGeneral-Italic" w:eastAsia="Times New Roman" w:hAnsi="STIXGeneral-Italic" w:cs="Lucida Grande"/>
+          <w:color w:val="000000"/>
+          <w:sz w:val="27"/>
+          <w:szCs w:val="27"/>
+          <w:bdr w:val="none" w:sz="0" w:space="0" w:color="auto" w:frame="1"/>
+        </w:rPr>
+        <w:t>M</w:t>
+      </w:r>
+      <w:r>
+        <w:rPr>
+          <w:rFonts w:ascii="STIXGeneral-Regular" w:eastAsia="Times New Roman" w:hAnsi="STIXGeneral-Regular" w:cs="Lucida Grande"/>
+          <w:color w:val="000000"/>
+          <w:sz w:val="19"/>
+          <w:szCs w:val="19"/>
+          <w:bdr w:val="none" w:sz="0" w:space="0" w:color="auto" w:frame="1"/>
+        </w:rPr>
+        <w:t>bh</w:t>
+      </w:r>
+      <w:proofErr w:type="spellEnd"/>
+      <w:r>
+        <w:rPr>
+          <w:rFonts w:ascii="STIXGeneral-Regular" w:eastAsia="Times New Roman" w:hAnsi="STIXGeneral-Regular" w:cs="Lucida Grande"/>
+          <w:color w:val="000000"/>
+          <w:sz w:val="27"/>
+          <w:szCs w:val="27"/>
+          <w:bdr w:val="none" w:sz="0" w:space="0" w:color="auto" w:frame="1"/>
+        </w:rPr>
+        <w:t>/</w:t>
+      </w:r>
+      <w:r>
+        <w:rPr>
+          <w:rFonts w:ascii="STIXGeneral-Italic" w:eastAsia="Times New Roman" w:hAnsi="STIXGeneral-Italic" w:cs="Lucida Grande"/>
+          <w:color w:val="000000"/>
+          <w:sz w:val="27"/>
+          <w:szCs w:val="27"/>
+          <w:bdr w:val="none" w:sz="0" w:space="0" w:color="auto" w:frame="1"/>
+        </w:rPr>
+        <w:t>M</w:t>
+      </w:r>
+      <w:r>
+        <w:rPr>
+          <w:rFonts w:ascii="STIXGeneral-Regular" w:eastAsia="Times New Roman" w:hAnsi="STIXGeneral-Regular" w:cs="Lucida Grande"/>
+          <w:color w:val="000000"/>
+          <w:sz w:val="19"/>
+          <w:szCs w:val="19"/>
+          <w:bdr w:val="none" w:sz="0" w:space="0" w:color="auto" w:frame="1"/>
+        </w:rPr>
+        <w:t>⊙</w:t>
+      </w:r>
+      <w:r>
+        <w:rPr>
+          <w:rFonts w:ascii="STIXGeneral-Regular" w:eastAsia="Times New Roman" w:hAnsi="STIXGeneral-Regular" w:cs="Lucida Grande"/>
+          <w:color w:val="000000"/>
+          <w:sz w:val="27"/>
+          <w:szCs w:val="27"/>
+          <w:bdr w:val="none" w:sz="0" w:space="0" w:color="auto" w:frame="1"/>
+        </w:rPr>
+        <w:t>&lt;10</w:t>
+      </w:r>
+      <w:r>
+        <w:rPr>
+          <w:rFonts w:ascii="STIXGeneral-Regular" w:eastAsia="Times New Roman" w:hAnsi="STIXGeneral-Regular" w:cs="Lucida Grande"/>
+          <w:color w:val="000000"/>
+          <w:sz w:val="19"/>
+          <w:szCs w:val="19"/>
+          <w:bdr w:val="none" w:sz="0" w:space="0" w:color="auto" w:frame="1"/>
+        </w:rPr>
+        <w:t>5</w:t>
+      </w:r>
+      <w:r>
+        <w:rPr>
+          <w:rFonts w:ascii="Lucida Grande" w:eastAsia="Times New Roman" w:hAnsi="Lucida Grande" w:cs="Lucida Grande"/>
+          <w:color w:val="000000"/>
+          <w:sz w:val="22"/>
+          <w:szCs w:val="22"/>
+          <w:shd w:val="clear" w:color="auto" w:fill="FFFFFF"/>
+        </w:rPr>
+        <w:t>), we highlight NGC 4713 and NGC 4178, both with </w:t>
+      </w:r>
+      <w:r>
+        <w:rPr>
+          <w:rFonts w:ascii="STIXGeneral-Italic" w:eastAsia="Times New Roman" w:hAnsi="STIXGeneral-Italic" w:cs="Lucida Grande"/>
+          <w:color w:val="000000"/>
+          <w:sz w:val="27"/>
+          <w:szCs w:val="27"/>
+          <w:bdr w:val="none" w:sz="0" w:space="0" w:color="auto" w:frame="1"/>
+        </w:rPr>
+        <w:t>M</w:t>
+      </w:r>
+      <w:r>
+        <w:rPr>
+          <w:rFonts w:ascii="STIXGeneral-Regular" w:eastAsia="Times New Roman" w:hAnsi="STIXGeneral-Regular" w:cs="Lucida Grande"/>
+          <w:color w:val="000000"/>
+          <w:sz w:val="19"/>
+          <w:szCs w:val="19"/>
+          <w:bdr w:val="none" w:sz="0" w:space="0" w:color="auto" w:frame="1"/>
+        </w:rPr>
+        <w:t>bh</w:t>
+      </w:r>
+      <w:r>
+        <w:rPr>
+          <w:rFonts w:ascii="STIXGeneral-Regular" w:eastAsia="Times New Roman" w:hAnsi="STIXGeneral-Regular" w:cs="Lucida Grande"/>
+          <w:color w:val="000000"/>
+          <w:sz w:val="27"/>
+          <w:szCs w:val="27"/>
+          <w:bdr w:val="none" w:sz="0" w:space="0" w:color="auto" w:frame="1"/>
+        </w:rPr>
+        <w:t>≈10</w:t>
+      </w:r>
+      <w:r>
+        <w:rPr>
+          <w:rFonts w:ascii="STIXGeneral-Regular" w:eastAsia="Times New Roman" w:hAnsi="STIXGeneral-Regular" w:cs="Lucida Grande"/>
+          <w:color w:val="000000"/>
+          <w:sz w:val="19"/>
+          <w:szCs w:val="19"/>
+          <w:bdr w:val="none" w:sz="0" w:space="0" w:color="auto" w:frame="1"/>
+        </w:rPr>
+        <w:t>3</w:t>
+      </w:r>
+      <w:r>
+        <w:rPr>
+          <w:rFonts w:ascii="Lucida Grande" w:eastAsia="Times New Roman" w:hAnsi="Lucida Grande" w:cs="Lucida Grande"/>
+          <w:color w:val="000000"/>
+          <w:sz w:val="22"/>
+          <w:szCs w:val="22"/>
+          <w:shd w:val="clear" w:color="auto" w:fill="FFFFFF"/>
+        </w:rPr>
+        <w:t>-</w:t>
+      </w:r>
+      <w:r>
+        <w:rPr>
+          <w:rFonts w:ascii="STIXGeneral-Regular" w:eastAsia="Times New Roman" w:hAnsi="STIXGeneral-Regular" w:cs="Lucida Grande"/>
+          <w:color w:val="000000"/>
+          <w:sz w:val="27"/>
+          <w:szCs w:val="27"/>
+          <w:bdr w:val="none" w:sz="0" w:space="0" w:color="auto" w:frame="1"/>
+        </w:rPr>
+        <w:t>10</w:t>
+      </w:r>
+      <w:r>
+        <w:rPr>
+          <w:rFonts w:ascii="STIXGeneral-Regular" w:eastAsia="Times New Roman" w:hAnsi="STIXGeneral-Regular" w:cs="Lucida Grande"/>
+          <w:color w:val="000000"/>
+          <w:sz w:val="19"/>
+          <w:szCs w:val="19"/>
+          <w:bdr w:val="none" w:sz="0" w:space="0" w:color="auto" w:frame="1"/>
+        </w:rPr>
+        <w:t>4</w:t>
+      </w:r>
+      <w:r>
+        <w:rPr>
+          <w:rFonts w:ascii="Lucida Grande" w:eastAsia="Times New Roman" w:hAnsi="Lucida Grande" w:cs="Lucida Grande"/>
+          <w:color w:val="000000"/>
+          <w:sz w:val="22"/>
+          <w:szCs w:val="22"/>
+          <w:shd w:val="clear" w:color="auto" w:fill="FFFFFF"/>
+        </w:rPr>
+        <w:t xml:space="preserve"> (an estimate which is further </w:t>
+      </w:r>
+      <w:r>
+        <w:rPr>
+          <w:rFonts w:ascii="Lucida Grande" w:eastAsia="Times New Roman" w:hAnsi="Lucida Grande" w:cs="Lucida Grande"/>
+          <w:color w:val="000000"/>
+          <w:sz w:val="22"/>
+          <w:szCs w:val="22"/>
+          <w:shd w:val="clear" w:color="auto" w:fill="FFFFFF"/>
+        </w:rPr>
+        <w:lastRenderedPageBreak/>
+        <w:t>supported in NGC 4718 by its nuclear star cluster mass). From Chandra archival data, we find that both galaxies have a point-like nuclear X-ray sourc</w:t>
+      </w:r>
       <w:bookmarkStart w:id="0" w:name="_GoBack"/>
       <w:bookmarkEnd w:id="0"/>
       <w:r>
@@ -3117,36 +3952,160 @@
           <w:szCs w:val="22"/>
           <w:shd w:val="clear" w:color="auto" w:fill="FFFFFF"/>
         </w:rPr>
+        <w:t xml:space="preserve">e, with unabsorbed 0.3-10 </w:t>
+      </w:r>
+      <w:proofErr w:type="spellStart"/>
+      <w:r>
+        <w:rPr>
+          <w:rFonts w:ascii="Lucida Grande" w:eastAsia="Times New Roman" w:hAnsi="Lucida Grande" w:cs="Lucida Grande"/>
+          <w:color w:val="000000"/>
+          <w:sz w:val="22"/>
+          <w:szCs w:val="22"/>
+          <w:shd w:val="clear" w:color="auto" w:fill="FFFFFF"/>
+        </w:rPr>
+        <w:t>keV</w:t>
+      </w:r>
+      <w:proofErr w:type="spellEnd"/>
+      <w:r>
+        <w:rPr>
+          <w:rFonts w:ascii="Lucida Grande" w:eastAsia="Times New Roman" w:hAnsi="Lucida Grande" w:cs="Lucida Grande"/>
+          <w:color w:val="000000"/>
+          <w:sz w:val="22"/>
+          <w:szCs w:val="22"/>
+          <w:shd w:val="clear" w:color="auto" w:fill="FFFFFF"/>
+        </w:rPr>
+        <w:t xml:space="preserve"> luminosities of a few times 10</w:t>
+      </w:r>
+      <w:r>
+        <w:rPr>
+          <w:rFonts w:ascii="STIXGeneral-Regular" w:eastAsia="Times New Roman" w:hAnsi="STIXGeneral-Regular" w:cs="Lucida Grande"/>
+          <w:color w:val="000000"/>
+          <w:sz w:val="19"/>
+          <w:szCs w:val="19"/>
+          <w:bdr w:val="none" w:sz="0" w:space="0" w:color="auto" w:frame="1"/>
+        </w:rPr>
+        <w:t>38</w:t>
+      </w:r>
+      <w:r>
+        <w:rPr>
+          <w:rFonts w:ascii="Lucida Grande" w:eastAsia="Times New Roman" w:hAnsi="Lucida Grande" w:cs="Lucida Grande"/>
+          <w:color w:val="000000"/>
+          <w:sz w:val="22"/>
+          <w:szCs w:val="22"/>
+          <w:shd w:val="clear" w:color="auto" w:fill="FFFFFF"/>
+        </w:rPr>
+        <w:t> erg/s. In NGC 4178, the nuclear source has a soft, probably thermal, spectrum consistent with a stellar-mass black hole in the high/soft state, while no strong constraints can be derived for the nuclear emission of NGC 4713. In total, 33 of the 74 galaxies are predicted to have </w:t>
+      </w:r>
+      <w:proofErr w:type="spellStart"/>
+      <w:r>
+        <w:rPr>
+          <w:rFonts w:ascii="STIXGeneral-Italic" w:eastAsia="Times New Roman" w:hAnsi="STIXGeneral-Italic" w:cs="Lucida Grande"/>
+          <w:color w:val="000000"/>
+          <w:sz w:val="27"/>
+          <w:szCs w:val="27"/>
+          <w:bdr w:val="none" w:sz="0" w:space="0" w:color="auto" w:frame="1"/>
+        </w:rPr>
+        <w:t>M</w:t>
+      </w:r>
+      <w:r>
+        <w:rPr>
+          <w:rFonts w:ascii="STIXGeneral-Regular" w:eastAsia="Times New Roman" w:hAnsi="STIXGeneral-Regular" w:cs="Lucida Grande"/>
+          <w:color w:val="000000"/>
+          <w:sz w:val="19"/>
+          <w:szCs w:val="19"/>
+          <w:bdr w:val="none" w:sz="0" w:space="0" w:color="auto" w:frame="1"/>
+        </w:rPr>
+        <w:t>bh</w:t>
+      </w:r>
+      <w:proofErr w:type="spellEnd"/>
+      <w:proofErr w:type="gramStart"/>
+      <w:r>
+        <w:rPr>
+          <w:rFonts w:ascii="STIXGeneral-Regular" w:eastAsia="Times New Roman" w:hAnsi="STIXGeneral-Regular" w:cs="Lucida Grande"/>
+          <w:color w:val="000000"/>
+          <w:sz w:val="27"/>
+          <w:szCs w:val="27"/>
+          <w:bdr w:val="none" w:sz="0" w:space="0" w:color="auto" w:frame="1"/>
+        </w:rPr>
+        <w:t>&lt;(</w:t>
+      </w:r>
+      <w:proofErr w:type="gramEnd"/>
+      <w:r>
+        <w:rPr>
+          <w:rFonts w:ascii="STIXGeneral-Regular" w:eastAsia="Times New Roman" w:hAnsi="STIXGeneral-Regular" w:cs="Lucida Grande"/>
+          <w:color w:val="000000"/>
+          <w:sz w:val="27"/>
+          <w:szCs w:val="27"/>
+          <w:bdr w:val="none" w:sz="0" w:space="0" w:color="auto" w:frame="1"/>
+        </w:rPr>
+        <w:t>10</w:t>
+      </w:r>
+      <w:r>
+        <w:rPr>
+          <w:rFonts w:ascii="STIXGeneral-Regular" w:eastAsia="Times New Roman" w:hAnsi="STIXGeneral-Regular" w:cs="Lucida Grande"/>
+          <w:color w:val="000000"/>
+          <w:sz w:val="19"/>
+          <w:szCs w:val="19"/>
+          <w:bdr w:val="none" w:sz="0" w:space="0" w:color="auto" w:frame="1"/>
+        </w:rPr>
+        <w:t>5</w:t>
+      </w:r>
+      <w:r>
+        <w:rPr>
+          <w:rFonts w:ascii="Lucida Grande" w:eastAsia="Times New Roman" w:hAnsi="Lucida Grande" w:cs="Lucida Grande"/>
+          <w:color w:val="000000"/>
+          <w:sz w:val="22"/>
+          <w:szCs w:val="22"/>
+          <w:shd w:val="clear" w:color="auto" w:fill="FFFFFF"/>
+        </w:rPr>
+        <w:t>-</w:t>
+      </w:r>
+      <w:r>
+        <w:rPr>
+          <w:rFonts w:ascii="STIXGeneral-Regular" w:eastAsia="Times New Roman" w:hAnsi="STIXGeneral-Regular" w:cs="Lucida Grande"/>
+          <w:color w:val="000000"/>
+          <w:sz w:val="27"/>
+          <w:szCs w:val="27"/>
+          <w:bdr w:val="none" w:sz="0" w:space="0" w:color="auto" w:frame="1"/>
+        </w:rPr>
+        <w:t>10</w:t>
+      </w:r>
+      <w:r>
+        <w:rPr>
+          <w:rFonts w:ascii="STIXGeneral-Regular" w:eastAsia="Times New Roman" w:hAnsi="STIXGeneral-Regular" w:cs="Lucida Grande"/>
+          <w:color w:val="000000"/>
+          <w:sz w:val="19"/>
+          <w:szCs w:val="19"/>
+          <w:bdr w:val="none" w:sz="0" w:space="0" w:color="auto" w:frame="1"/>
+        </w:rPr>
+        <w:t>6</w:t>
+      </w:r>
+      <w:r>
+        <w:rPr>
+          <w:rFonts w:ascii="STIXGeneral-Regular" w:eastAsia="Times New Roman" w:hAnsi="STIXGeneral-Regular" w:cs="Lucida Grande"/>
+          <w:color w:val="000000"/>
+          <w:sz w:val="27"/>
+          <w:szCs w:val="27"/>
+          <w:bdr w:val="none" w:sz="0" w:space="0" w:color="auto" w:frame="1"/>
+        </w:rPr>
+        <w:t>)</w:t>
+      </w:r>
+      <w:r>
+        <w:rPr>
+          <w:rFonts w:ascii="Lucida Grande" w:eastAsia="Times New Roman" w:hAnsi="Lucida Grande" w:cs="Lucida Grande"/>
+          <w:color w:val="000000"/>
+          <w:sz w:val="22"/>
+          <w:szCs w:val="22"/>
+          <w:shd w:val="clear" w:color="auto" w:fill="FFFFFF"/>
+        </w:rPr>
         <w:t> </w:t>
       </w:r>
-      <w:proofErr w:type="spellStart"/>
-      <w:r>
-        <w:rPr>
-          <w:rFonts w:ascii="Lucida Grande" w:eastAsia="Times New Roman" w:hAnsi="Lucida Grande" w:cs="Lucida Grande"/>
-          <w:color w:val="000000"/>
-          <w:sz w:val="22"/>
-          <w:szCs w:val="22"/>
-          <w:shd w:val="clear" w:color="auto" w:fill="FFFFFF"/>
-        </w:rPr>
-        <w:t>dex</w:t>
-      </w:r>
-      <w:proofErr w:type="spellEnd"/>
-      <w:r>
-        <w:rPr>
-          <w:rFonts w:ascii="Lucida Grande" w:eastAsia="Times New Roman" w:hAnsi="Lucida Grande" w:cs="Lucida Grande"/>
-          <w:color w:val="000000"/>
-          <w:sz w:val="22"/>
-          <w:szCs w:val="22"/>
-          <w:shd w:val="clear" w:color="auto" w:fill="FFFFFF"/>
-        </w:rPr>
-        <w:t xml:space="preserve"> for </w:t>
-      </w:r>
-      <w:r>
-        <w:rPr>
-          <w:rFonts w:ascii="STIXGeneral-Italic" w:eastAsia="Times New Roman" w:hAnsi="STIXGeneral-Italic" w:cs="Lucida Grande"/>
-          <w:color w:val="000000"/>
-          <w:sz w:val="26"/>
-          <w:szCs w:val="26"/>
+      <w:r>
+        <w:rPr>
+          <w:rFonts w:ascii="STIXGeneral-Italic" w:eastAsia="Times New Roman" w:hAnsi="STIXGeneral-Italic" w:cs="Lucida Grande"/>
+          <w:color w:val="000000"/>
+          <w:sz w:val="27"/>
+          <w:szCs w:val="27"/>
           <w:bdr w:val="none" w:sz="0" w:space="0" w:color="auto" w:frame="1"/>
         </w:rPr>
         <w:t>M</w:t>
@@ -3155,28 +4114,78 @@
         <w:rPr>
           <w:rFonts w:ascii="STIXGeneral-Regular" w:eastAsia="Times New Roman" w:hAnsi="STIXGeneral-Regular" w:cs="Lucida Grande"/>
           <w:color w:val="000000"/>
-          <w:sz w:val="18"/>
-          <w:szCs w:val="18"/>
-          <w:bdr w:val="none" w:sz="0" w:space="0" w:color="auto" w:frame="1"/>
-        </w:rPr>
-        <w:t>BH</w:t>
-      </w:r>
-      <w:r>
-        <w:rPr>
-          <w:rFonts w:ascii="Lucida Grande" w:eastAsia="Times New Roman" w:hAnsi="Lucida Grande" w:cs="Lucida Grande"/>
-          <w:color w:val="000000"/>
-          <w:sz w:val="22"/>
-          <w:szCs w:val="22"/>
-          <w:shd w:val="clear" w:color="auto" w:fill="FFFFFF"/>
-        </w:rPr>
-        <w:t> on </w:t>
-      </w:r>
-      <w:r>
-        <w:rPr>
-          <w:rFonts w:ascii="STIXGeneral-Italic" w:eastAsia="Times New Roman" w:hAnsi="STIXGeneral-Italic" w:cs="Lucida Grande"/>
-          <w:color w:val="000000"/>
-          <w:sz w:val="26"/>
-          <w:szCs w:val="26"/>
+          <w:sz w:val="19"/>
+          <w:szCs w:val="19"/>
+          <w:bdr w:val="none" w:sz="0" w:space="0" w:color="auto" w:frame="1"/>
+        </w:rPr>
+        <w:t>⊙</w:t>
+      </w:r>
+      <w:r>
+        <w:rPr>
+          <w:rFonts w:ascii="Lucida Grande" w:eastAsia="Times New Roman" w:hAnsi="Lucida Grande" w:cs="Lucida Grande"/>
+          <w:color w:val="000000"/>
+          <w:sz w:val="22"/>
+          <w:szCs w:val="22"/>
+          <w:shd w:val="clear" w:color="auto" w:fill="FFFFFF"/>
+        </w:rPr>
+        <w:t>, and several are consistently predicted, via three methods, to have masses of </w:t>
+      </w:r>
+      <w:r>
+        <w:rPr>
+          <w:rFonts w:ascii="STIXGeneral-Regular" w:eastAsia="Times New Roman" w:hAnsi="STIXGeneral-Regular" w:cs="Lucida Grande"/>
+          <w:color w:val="000000"/>
+          <w:sz w:val="27"/>
+          <w:szCs w:val="27"/>
+          <w:bdr w:val="none" w:sz="0" w:space="0" w:color="auto" w:frame="1"/>
+        </w:rPr>
+        <w:t>10</w:t>
+      </w:r>
+      <w:r>
+        <w:rPr>
+          <w:rFonts w:ascii="STIXGeneral-Regular" w:eastAsia="Times New Roman" w:hAnsi="STIXGeneral-Regular" w:cs="Lucida Grande"/>
+          <w:color w:val="000000"/>
+          <w:sz w:val="19"/>
+          <w:szCs w:val="19"/>
+          <w:bdr w:val="none" w:sz="0" w:space="0" w:color="auto" w:frame="1"/>
+        </w:rPr>
+        <w:t>4</w:t>
+      </w:r>
+      <w:r>
+        <w:rPr>
+          <w:rFonts w:ascii="Lucida Grande" w:eastAsia="Times New Roman" w:hAnsi="Lucida Grande" w:cs="Lucida Grande"/>
+          <w:color w:val="000000"/>
+          <w:sz w:val="22"/>
+          <w:szCs w:val="22"/>
+          <w:shd w:val="clear" w:color="auto" w:fill="FFFFFF"/>
+        </w:rPr>
+        <w:t>-</w:t>
+      </w:r>
+      <w:r>
+        <w:rPr>
+          <w:rFonts w:ascii="STIXGeneral-Regular" w:eastAsia="Times New Roman" w:hAnsi="STIXGeneral-Regular" w:cs="Lucida Grande"/>
+          <w:color w:val="000000"/>
+          <w:sz w:val="27"/>
+          <w:szCs w:val="27"/>
+          <w:bdr w:val="none" w:sz="0" w:space="0" w:color="auto" w:frame="1"/>
+        </w:rPr>
+        <w:t>10</w:t>
+      </w:r>
+      <w:r>
+        <w:rPr>
+          <w:rFonts w:ascii="STIXGeneral-Regular" w:eastAsia="Times New Roman" w:hAnsi="STIXGeneral-Regular" w:cs="Lucida Grande"/>
+          <w:color w:val="000000"/>
+          <w:sz w:val="19"/>
+          <w:szCs w:val="19"/>
+          <w:bdr w:val="none" w:sz="0" w:space="0" w:color="auto" w:frame="1"/>
+        </w:rPr>
+        <w:t>5</w:t>
+      </w:r>
+      <w:r>
+        <w:rPr>
+          <w:rFonts w:ascii="STIXGeneral-Italic" w:eastAsia="Times New Roman" w:hAnsi="STIXGeneral-Italic" w:cs="Lucida Grande"/>
+          <w:color w:val="000000"/>
+          <w:sz w:val="27"/>
+          <w:szCs w:val="27"/>
           <w:bdr w:val="none" w:sz="0" w:space="0" w:color="auto" w:frame="1"/>
         </w:rPr>
         <w:t>M</w:t>
@@ -3185,192 +4194,70 @@
         <w:rPr>
           <w:rFonts w:ascii="STIXGeneral-Regular" w:eastAsia="Times New Roman" w:hAnsi="STIXGeneral-Regular" w:cs="Lucida Grande"/>
           <w:color w:val="000000"/>
-          <w:sz w:val="18"/>
-          <w:szCs w:val="18"/>
-          <w:bdr w:val="none" w:sz="0" w:space="0" w:color="auto" w:frame="1"/>
-        </w:rPr>
-        <w:t>∗,</w:t>
-      </w:r>
-      <w:proofErr w:type="spellStart"/>
-      <w:r>
-        <w:rPr>
-          <w:rFonts w:ascii="STIXGeneral-Regular" w:eastAsia="Times New Roman" w:hAnsi="STIXGeneral-Regular" w:cs="Lucida Grande"/>
-          <w:color w:val="000000"/>
-          <w:sz w:val="18"/>
-          <w:szCs w:val="18"/>
-          <w:bdr w:val="none" w:sz="0" w:space="0" w:color="auto" w:frame="1"/>
-        </w:rPr>
-        <w:t>sph</w:t>
-      </w:r>
-      <w:proofErr w:type="spellEnd"/>
-      <w:r>
-        <w:rPr>
-          <w:rFonts w:ascii="Lucida Grande" w:eastAsia="Times New Roman" w:hAnsi="Lucida Grande" w:cs="Lucida Grande"/>
-          <w:color w:val="000000"/>
-          <w:sz w:val="22"/>
-          <w:szCs w:val="22"/>
-          <w:shd w:val="clear" w:color="auto" w:fill="FFFFFF"/>
-        </w:rPr>
-        <w:t> and </w:t>
-      </w:r>
-      <w:r>
-        <w:rPr>
-          <w:rFonts w:ascii="STIXGeneral-Regular" w:eastAsia="Times New Roman" w:hAnsi="STIXGeneral-Regular" w:cs="Lucida Grande"/>
-          <w:color w:val="000000"/>
-          <w:sz w:val="26"/>
-          <w:szCs w:val="26"/>
-          <w:bdr w:val="none" w:sz="0" w:space="0" w:color="auto" w:frame="1"/>
-        </w:rPr>
-        <w:t>0.57</w:t>
-      </w:r>
-      <w:r>
-        <w:rPr>
-          <w:rFonts w:ascii="Lucida Grande" w:eastAsia="Times New Roman" w:hAnsi="Lucida Grande" w:cs="Lucida Grande"/>
-          <w:color w:val="000000"/>
-          <w:sz w:val="22"/>
-          <w:szCs w:val="22"/>
-          <w:shd w:val="clear" w:color="auto" w:fill="FFFFFF"/>
-        </w:rPr>
-        <w:t> </w:t>
-      </w:r>
-      <w:proofErr w:type="spellStart"/>
-      <w:r>
-        <w:rPr>
-          <w:rFonts w:ascii="Lucida Grande" w:eastAsia="Times New Roman" w:hAnsi="Lucida Grande" w:cs="Lucida Grande"/>
-          <w:color w:val="000000"/>
-          <w:sz w:val="22"/>
-          <w:szCs w:val="22"/>
-          <w:shd w:val="clear" w:color="auto" w:fill="FFFFFF"/>
-        </w:rPr>
-        <w:t>dex</w:t>
-      </w:r>
-      <w:proofErr w:type="spellEnd"/>
-      <w:r>
-        <w:rPr>
-          <w:rFonts w:ascii="Lucida Grande" w:eastAsia="Times New Roman" w:hAnsi="Lucida Grande" w:cs="Lucida Grande"/>
-          <w:color w:val="000000"/>
-          <w:sz w:val="22"/>
-          <w:szCs w:val="22"/>
-          <w:shd w:val="clear" w:color="auto" w:fill="FFFFFF"/>
-        </w:rPr>
-        <w:t xml:space="preserve"> for </w:t>
-      </w:r>
-      <w:r>
-        <w:rPr>
-          <w:rFonts w:ascii="STIXGeneral-Italic" w:eastAsia="Times New Roman" w:hAnsi="STIXGeneral-Italic" w:cs="Lucida Grande"/>
-          <w:color w:val="000000"/>
-          <w:sz w:val="26"/>
-          <w:szCs w:val="26"/>
+          <w:sz w:val="19"/>
+          <w:szCs w:val="19"/>
+          <w:bdr w:val="none" w:sz="0" w:space="0" w:color="auto" w:frame="1"/>
+        </w:rPr>
+        <w:t>⊙</w:t>
+      </w:r>
+      <w:r>
+        <w:rPr>
+          <w:rFonts w:ascii="Lucida Grande" w:eastAsia="Times New Roman" w:hAnsi="Lucida Grande" w:cs="Lucida Grande"/>
+          <w:color w:val="000000"/>
+          <w:sz w:val="22"/>
+          <w:szCs w:val="22"/>
+          <w:shd w:val="clear" w:color="auto" w:fill="FFFFFF"/>
+        </w:rPr>
+        <w:t>, such as IC 3392, NGC 4294 and NGC 4413. We speculate that a sizeable population of IMBHs may reside in late-type spiral galaxies with low stellar mass (</w:t>
+      </w:r>
+      <w:r>
+        <w:rPr>
+          <w:rFonts w:ascii="STIXGeneral-Italic" w:eastAsia="Times New Roman" w:hAnsi="STIXGeneral-Italic" w:cs="Lucida Grande"/>
+          <w:color w:val="000000"/>
+          <w:sz w:val="27"/>
+          <w:szCs w:val="27"/>
           <w:bdr w:val="none" w:sz="0" w:space="0" w:color="auto" w:frame="1"/>
         </w:rPr>
         <w:t>M</w:t>
       </w:r>
-      <w:r>
-        <w:rPr>
-          <w:rFonts w:ascii="STIXGeneral-Regular" w:eastAsia="Times New Roman" w:hAnsi="STIXGeneral-Regular" w:cs="Lucida Grande"/>
-          <w:color w:val="000000"/>
-          <w:sz w:val="18"/>
-          <w:szCs w:val="18"/>
-          <w:bdr w:val="none" w:sz="0" w:space="0" w:color="auto" w:frame="1"/>
-        </w:rPr>
-        <w:t>BH</w:t>
-      </w:r>
-      <w:r>
-        <w:rPr>
-          <w:rFonts w:ascii="Lucida Grande" w:eastAsia="Times New Roman" w:hAnsi="Lucida Grande" w:cs="Lucida Grande"/>
-          <w:color w:val="000000"/>
-          <w:sz w:val="22"/>
-          <w:szCs w:val="22"/>
-          <w:shd w:val="clear" w:color="auto" w:fill="FFFFFF"/>
-        </w:rPr>
-        <w:t> on </w:t>
-      </w:r>
-      <w:r>
-        <w:rPr>
-          <w:rFonts w:ascii="STIXGeneral-Italic" w:eastAsia="Times New Roman" w:hAnsi="STIXGeneral-Italic" w:cs="Lucida Grande"/>
-          <w:color w:val="000000"/>
-          <w:sz w:val="26"/>
-          <w:szCs w:val="26"/>
-          <w:bdr w:val="none" w:sz="0" w:space="0" w:color="auto" w:frame="1"/>
-        </w:rPr>
-        <w:t>σ</w:t>
-      </w:r>
-      <w:r>
-        <w:rPr>
-          <w:rFonts w:ascii="STIXGeneral-Regular" w:eastAsia="Times New Roman" w:hAnsi="STIXGeneral-Regular" w:cs="Lucida Grande"/>
-          <w:color w:val="000000"/>
-          <w:sz w:val="18"/>
-          <w:szCs w:val="18"/>
-          <w:bdr w:val="none" w:sz="0" w:space="0" w:color="auto" w:frame="1"/>
-        </w:rPr>
-        <w:t>∗</w:t>
-      </w:r>
-      <w:r>
-        <w:rPr>
-          <w:rFonts w:ascii="Lucida Grande" w:eastAsia="Times New Roman" w:hAnsi="Lucida Grande" w:cs="Lucida Grande"/>
-          <w:color w:val="000000"/>
-          <w:sz w:val="22"/>
-          <w:szCs w:val="22"/>
-          <w:shd w:val="clear" w:color="auto" w:fill="FFFFFF"/>
-        </w:rPr>
-        <w:t>. The slope is </w:t>
-      </w:r>
-      <w:r>
-        <w:rPr>
-          <w:rFonts w:ascii="STIXGeneral-Regular" w:eastAsia="Times New Roman" w:hAnsi="STIXGeneral-Regular" w:cs="Lucida Grande"/>
-          <w:color w:val="000000"/>
-          <w:sz w:val="26"/>
-          <w:szCs w:val="26"/>
-          <w:bdr w:val="none" w:sz="0" w:space="0" w:color="auto" w:frame="1"/>
-        </w:rPr>
-        <w:t>&gt;2</w:t>
-      </w:r>
-      <w:r>
-        <w:rPr>
-          <w:rFonts w:ascii="Lucida Grande" w:eastAsia="Times New Roman" w:hAnsi="Lucida Grande" w:cs="Lucida Grande"/>
-          <w:color w:val="000000"/>
-          <w:sz w:val="22"/>
-          <w:szCs w:val="22"/>
-          <w:shd w:val="clear" w:color="auto" w:fill="FFFFFF"/>
-        </w:rPr>
-        <w:t> times that obtained using core-</w:t>
-      </w:r>
-      <w:r>
-        <w:rPr>
-          <w:rFonts w:ascii="-webkit-standard" w:eastAsia="Times New Roman" w:hAnsi="-webkit-standard" w:cs="Times New Roman"/>
-          <w:color w:val="000000"/>
-          <w:sz w:val="27"/>
-          <w:szCs w:val="27"/>
-          <w:shd w:val="clear" w:color="auto" w:fill="FFFFFF"/>
-        </w:rPr>
-        <w:t>Sérsic</w:t>
-      </w:r>
-      <w:r>
-        <w:rPr>
-          <w:rFonts w:ascii="Lucida Grande" w:eastAsia="Times New Roman" w:hAnsi="Lucida Grande" w:cs="Lucida Grande"/>
-          <w:color w:val="000000"/>
-          <w:sz w:val="22"/>
-          <w:szCs w:val="22"/>
-          <w:shd w:val="clear" w:color="auto" w:fill="FFFFFF"/>
-        </w:rPr>
-        <w:t xml:space="preserve"> </w:t>
-      </w:r>
-      <w:r>
-        <w:rPr>
-          <w:rFonts w:ascii="Lucida Grande" w:eastAsia="Times New Roman" w:hAnsi="Lucida Grande" w:cs="Lucida Grande"/>
-          <w:color w:val="000000"/>
-          <w:sz w:val="22"/>
-          <w:szCs w:val="22"/>
-          <w:shd w:val="clear" w:color="auto" w:fill="FFFFFF"/>
-        </w:rPr>
-        <w:t>early-type galaxies, echoing a similar result involving </w:t>
-      </w:r>
-      <w:r>
-        <w:rPr>
-          <w:rFonts w:ascii="STIXGeneral-Italic" w:eastAsia="Times New Roman" w:hAnsi="STIXGeneral-Italic" w:cs="Lucida Grande"/>
-          <w:color w:val="000000"/>
-          <w:sz w:val="26"/>
-          <w:szCs w:val="26"/>
+      <w:proofErr w:type="gramStart"/>
+      <w:r>
+        <w:rPr>
+          <w:rFonts w:ascii="STIXGeneral-Regular" w:eastAsia="Times New Roman" w:hAnsi="STIXGeneral-Regular" w:cs="Lucida Grande"/>
+          <w:color w:val="000000"/>
+          <w:sz w:val="19"/>
+          <w:szCs w:val="19"/>
+          <w:bdr w:val="none" w:sz="0" w:space="0" w:color="auto" w:frame="1"/>
+        </w:rPr>
+        <w:t>∗,galaxy</w:t>
+      </w:r>
+      <w:proofErr w:type="gramEnd"/>
+      <w:r>
+        <w:rPr>
+          <w:rFonts w:ascii="STIXGeneral-Regular" w:eastAsia="Times New Roman" w:hAnsi="STIXGeneral-Regular" w:cs="Lucida Grande"/>
+          <w:color w:val="000000"/>
+          <w:sz w:val="27"/>
+          <w:szCs w:val="27"/>
+          <w:bdr w:val="none" w:sz="0" w:space="0" w:color="auto" w:frame="1"/>
+        </w:rPr>
+        <w:t>≲10</w:t>
+      </w:r>
+      <w:r>
+        <w:rPr>
+          <w:rFonts w:ascii="STIXGeneral-Regular" w:eastAsia="Times New Roman" w:hAnsi="STIXGeneral-Regular" w:cs="Lucida Grande"/>
+          <w:color w:val="000000"/>
+          <w:sz w:val="19"/>
+          <w:szCs w:val="19"/>
+          <w:bdr w:val="none" w:sz="0" w:space="0" w:color="auto" w:frame="1"/>
+        </w:rPr>
+        <w:t>10</w:t>
+      </w:r>
+      <w:r>
+        <w:rPr>
+          <w:rFonts w:ascii="STIXGeneral-Italic" w:eastAsia="Times New Roman" w:hAnsi="STIXGeneral-Italic" w:cs="Lucida Grande"/>
+          <w:color w:val="000000"/>
+          <w:sz w:val="27"/>
+          <w:szCs w:val="27"/>
           <w:bdr w:val="none" w:sz="0" w:space="0" w:color="auto" w:frame="1"/>
         </w:rPr>
         <w:t>M</w:t>
@@ -3379,216 +4266,29 @@
         <w:rPr>
           <w:rFonts w:ascii="STIXGeneral-Regular" w:eastAsia="Times New Roman" w:hAnsi="STIXGeneral-Regular" w:cs="Lucida Grande"/>
           <w:color w:val="000000"/>
-          <w:sz w:val="18"/>
-          <w:szCs w:val="18"/>
-          <w:bdr w:val="none" w:sz="0" w:space="0" w:color="auto" w:frame="1"/>
-        </w:rPr>
-        <w:t>∗,</w:t>
-      </w:r>
-      <w:proofErr w:type="spellStart"/>
-      <w:r>
-        <w:rPr>
-          <w:rFonts w:ascii="STIXGeneral-Regular" w:eastAsia="Times New Roman" w:hAnsi="STIXGeneral-Regular" w:cs="Lucida Grande"/>
-          <w:color w:val="000000"/>
-          <w:sz w:val="18"/>
-          <w:szCs w:val="18"/>
-          <w:bdr w:val="none" w:sz="0" w:space="0" w:color="auto" w:frame="1"/>
-        </w:rPr>
-        <w:t>sph</w:t>
-      </w:r>
-      <w:proofErr w:type="spellEnd"/>
-      <w:r>
-        <w:rPr>
-          <w:rFonts w:ascii="Lucida Grande" w:eastAsia="Times New Roman" w:hAnsi="Lucida Grande" w:cs="Lucida Grande"/>
-          <w:color w:val="000000"/>
-          <w:sz w:val="22"/>
-          <w:szCs w:val="22"/>
-          <w:shd w:val="clear" w:color="auto" w:fill="FFFFFF"/>
-        </w:rPr>
-        <w:t>, and supporting a varied growth mechanism among different morphological types. This steeper relation has consequences for galaxy/black hole formation theories, simulations, and predicting black hole masses. We caution that (</w:t>
-      </w:r>
-      <w:proofErr w:type="spellStart"/>
-      <w:r>
-        <w:rPr>
-          <w:rFonts w:ascii="Lucida Grande" w:eastAsia="Times New Roman" w:hAnsi="Lucida Grande" w:cs="Lucida Grande"/>
-          <w:color w:val="000000"/>
-          <w:sz w:val="22"/>
-          <w:szCs w:val="22"/>
-          <w:shd w:val="clear" w:color="auto" w:fill="FFFFFF"/>
-        </w:rPr>
-        <w:t>i</w:t>
-      </w:r>
-      <w:proofErr w:type="spellEnd"/>
-      <w:r>
-        <w:rPr>
-          <w:rFonts w:ascii="Lucida Grande" w:eastAsia="Times New Roman" w:hAnsi="Lucida Grande" w:cs="Lucida Grande"/>
-          <w:color w:val="000000"/>
-          <w:sz w:val="22"/>
-          <w:szCs w:val="22"/>
-          <w:shd w:val="clear" w:color="auto" w:fill="FFFFFF"/>
-        </w:rPr>
-        <w:t>) a </w:t>
-      </w:r>
-      <w:proofErr w:type="spellStart"/>
-      <w:r>
-        <w:rPr>
-          <w:rFonts w:ascii="STIXGeneral-Italic" w:eastAsia="Times New Roman" w:hAnsi="STIXGeneral-Italic" w:cs="Lucida Grande"/>
-          <w:color w:val="000000"/>
-          <w:sz w:val="26"/>
-          <w:szCs w:val="26"/>
-          <w:bdr w:val="none" w:sz="0" w:space="0" w:color="auto" w:frame="1"/>
-        </w:rPr>
-        <w:t>M</w:t>
-      </w:r>
-      <w:r>
-        <w:rPr>
-          <w:rFonts w:ascii="STIXGeneral-Regular" w:eastAsia="Times New Roman" w:hAnsi="STIXGeneral-Regular" w:cs="Lucida Grande"/>
-          <w:color w:val="000000"/>
-          <w:sz w:val="18"/>
-          <w:szCs w:val="18"/>
-          <w:bdr w:val="none" w:sz="0" w:space="0" w:color="auto" w:frame="1"/>
-        </w:rPr>
-        <w:t>BH</w:t>
-      </w:r>
-      <w:r>
-        <w:rPr>
-          <w:rFonts w:ascii="Lucida Grande" w:eastAsia="Times New Roman" w:hAnsi="Lucida Grande" w:cs="Lucida Grande"/>
-          <w:color w:val="000000"/>
-          <w:sz w:val="22"/>
-          <w:szCs w:val="22"/>
-          <w:shd w:val="clear" w:color="auto" w:fill="FFFFFF"/>
-        </w:rPr>
-        <w:t>-</w:t>
-      </w:r>
-      <w:r>
-        <w:rPr>
-          <w:rFonts w:ascii="STIXGeneral-Italic" w:eastAsia="Times New Roman" w:hAnsi="STIXGeneral-Italic" w:cs="Lucida Grande"/>
-          <w:color w:val="000000"/>
-          <w:sz w:val="26"/>
-          <w:szCs w:val="26"/>
-          <w:bdr w:val="none" w:sz="0" w:space="0" w:color="auto" w:frame="1"/>
-        </w:rPr>
-        <w:t>M</w:t>
-      </w:r>
-      <w:proofErr w:type="gramStart"/>
-      <w:r>
-        <w:rPr>
-          <w:rFonts w:ascii="STIXGeneral-Regular" w:eastAsia="Times New Roman" w:hAnsi="STIXGeneral-Regular" w:cs="Lucida Grande"/>
-          <w:color w:val="000000"/>
-          <w:sz w:val="18"/>
-          <w:szCs w:val="18"/>
-          <w:bdr w:val="none" w:sz="0" w:space="0" w:color="auto" w:frame="1"/>
-        </w:rPr>
-        <w:t>∗,tot</w:t>
-      </w:r>
-      <w:proofErr w:type="spellEnd"/>
-      <w:proofErr w:type="gramEnd"/>
-      <w:r>
-        <w:rPr>
-          <w:rFonts w:ascii="Lucida Grande" w:eastAsia="Times New Roman" w:hAnsi="Lucida Grande" w:cs="Lucida Grande"/>
-          <w:color w:val="000000"/>
-          <w:sz w:val="22"/>
-          <w:szCs w:val="22"/>
-          <w:shd w:val="clear" w:color="auto" w:fill="FFFFFF"/>
-        </w:rPr>
-        <w:t> relation built from a mixture of early- and late-type galaxies will find an arbitrary slope of approximately 1 to 3, with no physical meaning beyond one's sample selection; and (ii) evolutionary studies of the </w:t>
-      </w:r>
-      <w:proofErr w:type="spellStart"/>
-      <w:r>
-        <w:rPr>
-          <w:rFonts w:ascii="STIXGeneral-Italic" w:eastAsia="Times New Roman" w:hAnsi="STIXGeneral-Italic" w:cs="Lucida Grande"/>
-          <w:color w:val="000000"/>
-          <w:sz w:val="26"/>
-          <w:szCs w:val="26"/>
-          <w:bdr w:val="none" w:sz="0" w:space="0" w:color="auto" w:frame="1"/>
-        </w:rPr>
-        <w:t>M</w:t>
-      </w:r>
-      <w:r>
-        <w:rPr>
-          <w:rFonts w:ascii="STIXGeneral-Regular" w:eastAsia="Times New Roman" w:hAnsi="STIXGeneral-Regular" w:cs="Lucida Grande"/>
-          <w:color w:val="000000"/>
-          <w:sz w:val="18"/>
-          <w:szCs w:val="18"/>
-          <w:bdr w:val="none" w:sz="0" w:space="0" w:color="auto" w:frame="1"/>
-        </w:rPr>
-        <w:t>BH</w:t>
-      </w:r>
-      <w:r>
-        <w:rPr>
-          <w:rFonts w:ascii="Lucida Grande" w:eastAsia="Times New Roman" w:hAnsi="Lucida Grande" w:cs="Lucida Grande"/>
-          <w:color w:val="000000"/>
-          <w:sz w:val="22"/>
-          <w:szCs w:val="22"/>
-          <w:shd w:val="clear" w:color="auto" w:fill="FFFFFF"/>
-        </w:rPr>
-        <w:t>-</w:t>
-      </w:r>
-      <w:r>
-        <w:rPr>
-          <w:rFonts w:ascii="STIXGeneral-Italic" w:eastAsia="Times New Roman" w:hAnsi="STIXGeneral-Italic" w:cs="Lucida Grande"/>
-          <w:color w:val="000000"/>
-          <w:sz w:val="26"/>
-          <w:szCs w:val="26"/>
-          <w:bdr w:val="none" w:sz="0" w:space="0" w:color="auto" w:frame="1"/>
-        </w:rPr>
-        <w:t>M</w:t>
-      </w:r>
-      <w:r>
-        <w:rPr>
-          <w:rFonts w:ascii="STIXGeneral-Regular" w:eastAsia="Times New Roman" w:hAnsi="STIXGeneral-Regular" w:cs="Lucida Grande"/>
-          <w:color w:val="000000"/>
-          <w:sz w:val="18"/>
-          <w:szCs w:val="18"/>
-          <w:bdr w:val="none" w:sz="0" w:space="0" w:color="auto" w:frame="1"/>
-        </w:rPr>
-        <w:t>∗,tot</w:t>
-      </w:r>
-      <w:proofErr w:type="spellEnd"/>
-      <w:r>
-        <w:rPr>
-          <w:rFonts w:ascii="Lucida Grande" w:eastAsia="Times New Roman" w:hAnsi="Lucida Grande" w:cs="Lucida Grande"/>
-          <w:color w:val="000000"/>
-          <w:sz w:val="22"/>
-          <w:szCs w:val="22"/>
-          <w:shd w:val="clear" w:color="auto" w:fill="FFFFFF"/>
-        </w:rPr>
-        <w:t> relation need to be mindful of the galaxy types included at each epoch. We additionally update the </w:t>
-      </w:r>
-      <w:proofErr w:type="spellStart"/>
-      <w:r>
-        <w:rPr>
-          <w:rFonts w:ascii="STIXGeneral-Italic" w:eastAsia="Times New Roman" w:hAnsi="STIXGeneral-Italic" w:cs="Lucida Grande"/>
-          <w:color w:val="000000"/>
-          <w:sz w:val="26"/>
-          <w:szCs w:val="26"/>
-          <w:bdr w:val="none" w:sz="0" w:space="0" w:color="auto" w:frame="1"/>
-        </w:rPr>
-        <w:t>M</w:t>
-      </w:r>
-      <w:proofErr w:type="gramStart"/>
-      <w:r>
-        <w:rPr>
-          <w:rFonts w:ascii="STIXGeneral-Regular" w:eastAsia="Times New Roman" w:hAnsi="STIXGeneral-Regular" w:cs="Lucida Grande"/>
-          <w:color w:val="000000"/>
-          <w:sz w:val="18"/>
-          <w:szCs w:val="18"/>
-          <w:bdr w:val="none" w:sz="0" w:space="0" w:color="auto" w:frame="1"/>
-        </w:rPr>
-        <w:t>∗,tot</w:t>
-      </w:r>
-      <w:proofErr w:type="spellEnd"/>
-      <w:proofErr w:type="gramEnd"/>
-      <w:r>
-        <w:rPr>
-          <w:rFonts w:ascii="Lucida Grande" w:eastAsia="Times New Roman" w:hAnsi="Lucida Grande" w:cs="Lucida Grande"/>
-          <w:color w:val="000000"/>
-          <w:sz w:val="22"/>
-          <w:szCs w:val="22"/>
-          <w:shd w:val="clear" w:color="auto" w:fill="FFFFFF"/>
-        </w:rPr>
-        <w:t>-(face-on spiral arm pitch angle) relation.</w:t>
-      </w:r>
+          <w:sz w:val="19"/>
+          <w:szCs w:val="19"/>
+          <w:bdr w:val="none" w:sz="0" w:space="0" w:color="auto" w:frame="1"/>
+        </w:rPr>
+        <w:t>⊙</w:t>
+      </w:r>
+      <w:r>
+        <w:rPr>
+          <w:rFonts w:ascii="Lucida Grande" w:eastAsia="Times New Roman" w:hAnsi="Lucida Grande" w:cs="Lucida Grande"/>
+          <w:color w:val="000000"/>
+          <w:sz w:val="22"/>
+          <w:szCs w:val="22"/>
+          <w:shd w:val="clear" w:color="auto" w:fill="FFFFFF"/>
+        </w:rPr>
+        <w:t>).</w:t>
+      </w:r>
+    </w:p>
+    <w:p>
+      <w:pPr>
+        <w:rPr>
+          <w:rFonts w:ascii="Times New Roman" w:eastAsia="Times New Roman" w:hAnsi="Times New Roman" w:cs="Times New Roman"/>
+        </w:rPr>
+      </w:pPr>
     </w:p>
     <w:sectPr>
       <w:pgSz w:w="11900" w:h="16840"/>

</xml_diff>